<commit_message>
Subo las Historias de usuario
</commit_message>
<xml_diff>
--- a/Documentation/Historias de usuario-ca.docx
+++ b/Documentation/Historias de usuario-ca.docx
@@ -1,12 +1,15 @@
 
 <file path=word/document.xml><?xml version="1.0" encoding="utf-8"?>
-<w:document xmlns:wpc="http://schemas.microsoft.com/office/word/2010/wordprocessingCanvas" xmlns:cx="http://schemas.microsoft.com/office/drawing/2014/chartex" xmlns:cx1="http://schemas.microsoft.com/office/drawing/2015/9/8/chartex" xmlns:cx2="http://schemas.microsoft.com/office/drawing/2015/10/21/chartex" xmlns:cx3="http://schemas.microsoft.com/office/drawing/2016/5/9/chartex" xmlns:cx4="http://schemas.microsoft.com/office/drawing/2016/5/10/chartex" xmlns:cx5="http://schemas.microsoft.com/office/drawing/2016/5/11/chartex" xmlns:cx6="http://schemas.microsoft.com/office/drawing/2016/5/12/chartex" xmlns:cx7="http://schemas.microsoft.com/office/drawing/2016/5/13/chartex" xmlns:cx8="http://schemas.microsoft.com/office/drawing/2016/5/14/chartex" xmlns:mc="http://schemas.openxmlformats.org/markup-compatibility/2006" xmlns:aink="http://schemas.microsoft.com/office/drawing/2016/ink" xmlns:am3d="http://schemas.microsoft.com/office/drawing/2017/model3d" xmlns:o="urn:schemas-microsoft-com:office:office" xmlns:oel="http://schemas.microsoft.com/office/2019/extlst" xmlns:r="http://schemas.openxmlformats.org/officeDocument/2006/relationships" xmlns:m="http://schemas.openxmlformats.org/officeDocument/2006/math" xmlns:v="urn:schemas-microsoft-com:vml" xmlns:wp14="http://schemas.microsoft.com/office/word/2010/wordprocessingDrawing" xmlns:wp="http://schemas.openxmlformats.org/drawingml/2006/wordprocessingDrawing" xmlns:w10="urn:schemas-microsoft-com:office:word" xmlns:w="http://schemas.openxmlformats.org/wordprocessingml/2006/main" xmlns:w14="http://schemas.microsoft.com/office/word/2010/wordml" xmlns:w15="http://schemas.microsoft.com/office/word/2012/wordml" xmlns:w16cex="http://schemas.microsoft.com/office/word/2018/wordml/cex" xmlns:w16cid="http://schemas.microsoft.com/office/word/2016/wordml/cid" xmlns:w16="http://schemas.microsoft.com/office/word/2018/wordml" xmlns:w16du="http://schemas.microsoft.com/office/word/2023/wordml/word16du" xmlns:w16sdtdh="http://schemas.microsoft.com/office/word/2020/wordml/sdtdatahash" xmlns:w16sdtfl="http://schemas.microsoft.com/office/word/2024/wordml/sdtformatlock" xmlns:w16se="http://schemas.microsoft.com/office/word/2015/wordml/symex" xmlns:wpg="http://schemas.microsoft.com/office/word/2010/wordprocessingGroup" xmlns:wpi="http://schemas.microsoft.com/office/word/2010/wordprocessingInk" xmlns:wne="http://schemas.microsoft.com/office/word/2006/wordml" xmlns:wps="http://schemas.microsoft.com/office/word/2010/wordprocessingShape" mc:Ignorable="w14 w15 w16se w16cid w16 w16cex w16sdtdh w16sdtfl w16du wp14">
+<w:document xmlns:wpc="http://schemas.microsoft.com/office/word/2010/wordprocessingCanvas" xmlns:cx="http://schemas.microsoft.com/office/drawing/2014/chartex" xmlns:cx1="http://schemas.microsoft.com/office/drawing/2015/9/8/chartex" xmlns:cx2="http://schemas.microsoft.com/office/drawing/2015/10/21/chartex" xmlns:cx3="http://schemas.microsoft.com/office/drawing/2016/5/9/chartex" xmlns:cx4="http://schemas.microsoft.com/office/drawing/2016/5/10/chartex" xmlns:cx5="http://schemas.microsoft.com/office/drawing/2016/5/11/chartex" xmlns:cx6="http://schemas.microsoft.com/office/drawing/2016/5/12/chartex" xmlns:cx7="http://schemas.microsoft.com/office/drawing/2016/5/13/chartex" xmlns:cx8="http://schemas.microsoft.com/office/drawing/2016/5/14/chartex" xmlns:mc="http://schemas.openxmlformats.org/markup-compatibility/2006" xmlns:aink="http://schemas.microsoft.com/office/drawing/2016/ink" xmlns:am3d="http://schemas.microsoft.com/office/drawing/2017/model3d" xmlns:o="urn:schemas-microsoft-com:office:office" xmlns:oel="http://schemas.microsoft.com/office/2019/extlst" xmlns:r="http://schemas.openxmlformats.org/officeDocument/2006/relationships" xmlns:m="http://schemas.openxmlformats.org/officeDocument/2006/math" xmlns:v="urn:schemas-microsoft-com:vml" xmlns:wp14="http://schemas.microsoft.com/office/word/2010/wordprocessingDrawing" xmlns:wp="http://schemas.openxmlformats.org/drawingml/2006/wordprocessingDrawing" xmlns:w10="urn:schemas-microsoft-com:office:word" xmlns:w="http://schemas.openxmlformats.org/wordprocessingml/2006/main" xmlns:w14="http://schemas.microsoft.com/office/word/2010/wordml" xmlns:w15="http://schemas.microsoft.com/office/word/2012/wordml" xmlns:w16cex="http://schemas.microsoft.com/office/word/2018/wordml/cex" xmlns:w16cid="http://schemas.microsoft.com/office/word/2016/wordml/cid" xmlns:w16="http://schemas.microsoft.com/office/word/2018/wordml" xmlns:w16du="http://schemas.microsoft.com/office/word/2023/wordml/word16du" xmlns:w16sdtdh="http://schemas.microsoft.com/office/word/2020/wordml/sdtdatahash" xmlns:w16se="http://schemas.microsoft.com/office/word/2015/wordml/symex" xmlns:wpg="http://schemas.microsoft.com/office/word/2010/wordprocessingGroup" xmlns:wpi="http://schemas.microsoft.com/office/word/2010/wordprocessingInk" xmlns:wne="http://schemas.microsoft.com/office/word/2006/wordml" xmlns:wps="http://schemas.microsoft.com/office/word/2010/wordprocessingShape" mc:Ignorable="w14 w15 w16se w16cid w16 w16cex w16sdtdh wp14">
   <w:body>
     <w:p>
       <w:pPr>
+        <w:jc w:val="center"/>
         <w:rPr>
           <w:b/>
           <w:bCs/>
+          <w:sz w:val="36"/>
+          <w:szCs w:val="36"/>
           <w:lang w:val="es-ES"/>
         </w:rPr>
       </w:pPr>
@@ -14,17 +17,12 @@
         <w:rPr>
           <w:b/>
           <w:bCs/>
+          <w:sz w:val="36"/>
+          <w:szCs w:val="36"/>
           <w:lang w:val="es-ES"/>
         </w:rPr>
         <w:t>Historia de usuario</w:t>
       </w:r>
-    </w:p>
-    <w:p>
-      <w:pPr>
-        <w:rPr>
-          <w:lang w:val="es-ES"/>
-        </w:rPr>
-      </w:pPr>
     </w:p>
     <w:p>
       <w:pPr>
@@ -36,6 +34,8 @@
         <w:rPr>
           <w:b/>
           <w:bCs/>
+          <w:sz w:val="28"/>
+          <w:szCs w:val="28"/>
           <w:lang w:val="es-ES"/>
         </w:rPr>
       </w:pPr>
@@ -43,71 +43,351 @@
         <w:rPr>
           <w:b/>
           <w:bCs/>
-          <w:lang w:val="es-ES"/>
-        </w:rPr>
-        <w:t>Historia: Solicitar pedido</w:t>
+          <w:sz w:val="28"/>
+          <w:szCs w:val="28"/>
+          <w:lang w:val="es-ES"/>
+        </w:rPr>
+        <w:t xml:space="preserve">Historia: </w:t>
+      </w:r>
+      <w:r>
+        <w:rPr>
+          <w:b/>
+          <w:bCs/>
+          <w:sz w:val="28"/>
+          <w:szCs w:val="28"/>
+          <w:lang w:val="es-ES"/>
+        </w:rPr>
+        <w:t>Cliente</w:t>
       </w:r>
     </w:p>
     <w:p>
       <w:pPr>
-        <w:ind w:left="360"/>
-        <w:rPr>
-          <w:lang w:val="es-ES"/>
-        </w:rPr>
-      </w:pPr>
-      <w:r>
-        <w:rPr>
+        <w:pStyle w:val="Prrafodelista"/>
+        <w:numPr>
+          <w:ilvl w:val="1"/>
+          <w:numId w:val="2"/>
+        </w:numPr>
+        <w:rPr>
+          <w:sz w:val="22"/>
+          <w:szCs w:val="22"/>
+          <w:lang w:val="es-ES"/>
+        </w:rPr>
+      </w:pPr>
+      <w:r>
+        <w:rPr>
+          <w:sz w:val="22"/>
+          <w:szCs w:val="22"/>
           <w:lang w:val="es-ES"/>
         </w:rPr>
         <w:t xml:space="preserve">Como cliente </w:t>
       </w:r>
       <w:r>
         <w:rPr>
-          <w:lang w:val="es-ES"/>
-        </w:rPr>
-        <w:t>del restaurante</w:t>
+          <w:sz w:val="22"/>
+          <w:szCs w:val="22"/>
+          <w:lang w:val="es-ES"/>
+        </w:rPr>
+        <w:t xml:space="preserve">del </w:t>
+      </w:r>
+      <w:r>
+        <w:rPr>
+          <w:sz w:val="22"/>
+          <w:szCs w:val="22"/>
+          <w:lang w:val="es-ES"/>
+        </w:rPr>
+        <w:t>restaurante,</w:t>
+      </w:r>
+      <w:r>
+        <w:rPr>
+          <w:sz w:val="22"/>
+          <w:szCs w:val="22"/>
+          <w:lang w:val="es-ES"/>
+        </w:rPr>
+        <w:t xml:space="preserve"> q</w:t>
+      </w:r>
+      <w:r>
+        <w:rPr>
+          <w:sz w:val="22"/>
+          <w:szCs w:val="22"/>
+          <w:lang w:val="es-ES"/>
+        </w:rPr>
+        <w:t>uiero hacer un pedido</w:t>
+      </w:r>
+      <w:r>
+        <w:rPr>
+          <w:sz w:val="22"/>
+          <w:szCs w:val="22"/>
+          <w:lang w:val="es-ES"/>
+        </w:rPr>
+        <w:t>.</w:t>
       </w:r>
     </w:p>
     <w:p>
       <w:pPr>
-        <w:ind w:left="360"/>
-        <w:rPr>
-          <w:lang w:val="es-ES"/>
-        </w:rPr>
-      </w:pPr>
-      <w:r>
-        <w:rPr>
-          <w:lang w:val="es-ES"/>
-        </w:rPr>
-        <w:t>Quiero hacer un pedido</w:t>
+        <w:pStyle w:val="Prrafodelista"/>
+        <w:numPr>
+          <w:ilvl w:val="1"/>
+          <w:numId w:val="2"/>
+        </w:numPr>
+        <w:rPr>
+          <w:sz w:val="22"/>
+          <w:szCs w:val="22"/>
+          <w:lang w:val="es-ES"/>
+        </w:rPr>
+      </w:pPr>
+      <w:r>
+        <w:rPr>
+          <w:sz w:val="22"/>
+          <w:szCs w:val="22"/>
+          <w:lang w:val="es-ES"/>
+        </w:rPr>
+        <w:t>Como cliente del restaurante</w:t>
+      </w:r>
+      <w:r>
+        <w:rPr>
+          <w:sz w:val="22"/>
+          <w:szCs w:val="22"/>
+          <w:lang w:val="es-ES"/>
+        </w:rPr>
+        <w:t>, quiero confirmar mi pedido</w:t>
+      </w:r>
+      <w:r>
+        <w:rPr>
+          <w:sz w:val="22"/>
+          <w:szCs w:val="22"/>
+          <w:lang w:val="es-ES"/>
+        </w:rPr>
+        <w:t>.</w:t>
       </w:r>
     </w:p>
     <w:p>
       <w:pPr>
-        <w:ind w:left="360"/>
-        <w:rPr>
-          <w:lang w:val="es-ES"/>
-        </w:rPr>
-      </w:pPr>
-      <w:r>
-        <w:rPr>
-          <w:lang w:val="es-ES"/>
-        </w:rPr>
-        <w:t xml:space="preserve">Para </w:t>
+        <w:pStyle w:val="Prrafodelista"/>
+        <w:numPr>
+          <w:ilvl w:val="1"/>
+          <w:numId w:val="2"/>
+        </w:numPr>
+        <w:rPr>
+          <w:sz w:val="22"/>
+          <w:szCs w:val="22"/>
+          <w:lang w:val="es-ES"/>
+        </w:rPr>
+      </w:pPr>
+      <w:r>
+        <w:rPr>
+          <w:sz w:val="22"/>
+          <w:szCs w:val="22"/>
+          <w:lang w:val="es-ES"/>
+        </w:rPr>
+        <w:t>Como cliente del restaurante, quiero cancelar mi pedid</w:t>
+      </w:r>
+      <w:r>
+        <w:rPr>
+          <w:sz w:val="22"/>
+          <w:szCs w:val="22"/>
+          <w:lang w:val="es-ES"/>
+        </w:rPr>
+        <w:t>o.</w:t>
       </w:r>
     </w:p>
     <w:p>
       <w:pPr>
-        <w:rPr>
-          <w:lang w:val="es-ES"/>
-        </w:rPr>
-      </w:pPr>
-      <w:r>
-        <w:rPr>
-          <w:lang w:val="es-ES"/>
-        </w:rPr>
-        <w:tab/>
-      </w:r>
+        <w:pStyle w:val="Prrafodelista"/>
+        <w:numPr>
+          <w:ilvl w:val="1"/>
+          <w:numId w:val="2"/>
+        </w:numPr>
+        <w:rPr>
+          <w:sz w:val="22"/>
+          <w:szCs w:val="22"/>
+          <w:lang w:val="es-ES"/>
+        </w:rPr>
+      </w:pPr>
+      <w:r>
+        <w:rPr>
+          <w:sz w:val="22"/>
+          <w:szCs w:val="22"/>
+          <w:lang w:val="es-ES"/>
+        </w:rPr>
+        <w:t xml:space="preserve">Como cliente del </w:t>
+      </w:r>
+      <w:r>
+        <w:rPr>
+          <w:sz w:val="22"/>
+          <w:szCs w:val="22"/>
+          <w:lang w:val="es-ES"/>
+        </w:rPr>
+        <w:t>restaurante, quiero</w:t>
+      </w:r>
+      <w:r>
+        <w:rPr>
+          <w:sz w:val="22"/>
+          <w:szCs w:val="22"/>
+          <w:lang w:val="es-ES"/>
+        </w:rPr>
+        <w:t xml:space="preserve"> </w:t>
+      </w:r>
+      <w:r>
+        <w:rPr>
+          <w:sz w:val="22"/>
+          <w:szCs w:val="22"/>
+          <w:lang w:val="es-ES"/>
+        </w:rPr>
+        <w:t>agregar o quitar productos de mi pedido.</w:t>
+      </w:r>
+    </w:p>
+    <w:p>
+      <w:pPr>
+        <w:pStyle w:val="Prrafodelista"/>
+        <w:numPr>
+          <w:ilvl w:val="1"/>
+          <w:numId w:val="2"/>
+        </w:numPr>
+        <w:rPr>
+          <w:sz w:val="22"/>
+          <w:szCs w:val="22"/>
+          <w:lang w:val="es-ES"/>
+        </w:rPr>
+      </w:pPr>
+      <w:r>
+        <w:rPr>
+          <w:sz w:val="22"/>
+          <w:szCs w:val="22"/>
+          <w:lang w:val="es-ES"/>
+        </w:rPr>
+        <w:t xml:space="preserve">Como cliente del restaurante, quiero </w:t>
+      </w:r>
+      <w:r>
+        <w:rPr>
+          <w:sz w:val="22"/>
+          <w:szCs w:val="22"/>
+          <w:lang w:val="es-ES"/>
+        </w:rPr>
+        <w:t xml:space="preserve">pagar mi </w:t>
+      </w:r>
+      <w:r>
+        <w:rPr>
+          <w:sz w:val="22"/>
+          <w:szCs w:val="22"/>
+          <w:lang w:val="es-ES"/>
+        </w:rPr>
+        <w:t>pedido, para poder llevármelo a casa.</w:t>
+      </w:r>
+    </w:p>
+    <w:p>
+      <w:pPr>
+        <w:pStyle w:val="Prrafodelista"/>
+        <w:numPr>
+          <w:ilvl w:val="1"/>
+          <w:numId w:val="2"/>
+        </w:numPr>
+        <w:rPr>
+          <w:sz w:val="22"/>
+          <w:szCs w:val="22"/>
+          <w:lang w:val="es-ES"/>
+        </w:rPr>
+      </w:pPr>
+      <w:r>
+        <w:rPr>
+          <w:sz w:val="22"/>
+          <w:szCs w:val="22"/>
+          <w:lang w:val="es-ES"/>
+        </w:rPr>
+        <w:t xml:space="preserve">Como cliente del restaurante, quiero </w:t>
+      </w:r>
+      <w:r>
+        <w:rPr>
+          <w:sz w:val="22"/>
+          <w:szCs w:val="22"/>
+          <w:lang w:val="es-ES"/>
+        </w:rPr>
+        <w:t>pagar con distintos modos de pago.</w:t>
+      </w:r>
+    </w:p>
+    <w:p>
+      <w:pPr>
+        <w:pStyle w:val="Prrafodelista"/>
+        <w:numPr>
+          <w:ilvl w:val="1"/>
+          <w:numId w:val="2"/>
+        </w:numPr>
+        <w:rPr>
+          <w:sz w:val="22"/>
+          <w:szCs w:val="22"/>
+          <w:lang w:val="es-ES"/>
+        </w:rPr>
+      </w:pPr>
+      <w:r>
+        <w:rPr>
+          <w:sz w:val="22"/>
+          <w:szCs w:val="22"/>
+          <w:lang w:val="es-ES"/>
+        </w:rPr>
+        <w:t>Como cliente del restaurante, quiero recibir una factura, para tener en cuenta el gasto realizado en el restaurante.</w:t>
+      </w:r>
+    </w:p>
+    <w:p>
+      <w:pPr>
+        <w:pStyle w:val="Prrafodelista"/>
+        <w:numPr>
+          <w:ilvl w:val="1"/>
+          <w:numId w:val="2"/>
+        </w:numPr>
+        <w:rPr>
+          <w:sz w:val="22"/>
+          <w:szCs w:val="22"/>
+          <w:lang w:val="es-ES"/>
+        </w:rPr>
+      </w:pPr>
+      <w:r>
+        <w:rPr>
+          <w:sz w:val="22"/>
+          <w:szCs w:val="22"/>
+          <w:lang w:val="es-ES"/>
+        </w:rPr>
+        <w:t>Como cliente del restaurante,</w:t>
+      </w:r>
+      <w:r>
+        <w:rPr>
+          <w:sz w:val="22"/>
+          <w:szCs w:val="22"/>
+          <w:lang w:val="es-ES"/>
+        </w:rPr>
+        <w:t xml:space="preserve"> q</w:t>
+      </w:r>
+      <w:r>
+        <w:rPr>
+          <w:sz w:val="22"/>
+          <w:szCs w:val="22"/>
+          <w:lang w:val="es-ES"/>
+        </w:rPr>
+        <w:t>uiero poder navegar por el menú interactivo,</w:t>
+      </w:r>
+      <w:r>
+        <w:rPr>
+          <w:sz w:val="22"/>
+          <w:szCs w:val="22"/>
+          <w:lang w:val="es-ES"/>
+        </w:rPr>
+        <w:t xml:space="preserve"> p</w:t>
+      </w:r>
+      <w:r>
+        <w:rPr>
+          <w:sz w:val="22"/>
+          <w:szCs w:val="22"/>
+          <w:lang w:val="es-ES"/>
+        </w:rPr>
+        <w:t>ara poder seleccionar productos y realizar mi pedido fácilmente.</w:t>
+      </w:r>
+    </w:p>
+    <w:p>
+      <w:pPr>
+        <w:pStyle w:val="Prrafodelista"/>
+        <w:ind w:left="735"/>
+        <w:rPr>
+          <w:lang w:val="es-ES"/>
+        </w:rPr>
+      </w:pPr>
     </w:p>
     <w:p>
       <w:pPr>
@@ -119,6 +399,8 @@
         <w:rPr>
           <w:b/>
           <w:bCs/>
+          <w:sz w:val="28"/>
+          <w:szCs w:val="28"/>
           <w:lang w:val="es-ES"/>
         </w:rPr>
       </w:pPr>
@@ -126,49 +408,667 @@
         <w:rPr>
           <w:b/>
           <w:bCs/>
-          <w:lang w:val="es-ES"/>
-        </w:rPr>
-        <w:t>Historia:</w:t>
+          <w:sz w:val="28"/>
+          <w:szCs w:val="28"/>
+          <w:lang w:val="es-ES"/>
+        </w:rPr>
+        <w:t xml:space="preserve">Historia: </w:t>
       </w:r>
       <w:r>
         <w:rPr>
           <w:b/>
           <w:bCs/>
-          <w:lang w:val="es-ES"/>
-        </w:rPr>
-        <w:t xml:space="preserve"> Agregar producto al pedido</w:t>
+          <w:sz w:val="28"/>
+          <w:szCs w:val="28"/>
+          <w:lang w:val="es-ES"/>
+        </w:rPr>
+        <w:t>Administrador</w:t>
+      </w:r>
+      <w:r>
+        <w:rPr>
+          <w:b/>
+          <w:bCs/>
+          <w:sz w:val="28"/>
+          <w:szCs w:val="28"/>
+          <w:lang w:val="es-ES"/>
+        </w:rPr>
+        <w:t xml:space="preserve">-Inventario </w:t>
       </w:r>
     </w:p>
     <w:p>
       <w:pPr>
         <w:pStyle w:val="Prrafodelista"/>
-        <w:rPr>
-          <w:lang w:val="es-ES"/>
-        </w:rPr>
-      </w:pPr>
-      <w:r>
-        <w:rPr>
-          <w:lang w:val="es-ES"/>
-        </w:rPr>
-        <w:t>Como cliente del restaurante</w:t>
+        <w:numPr>
+          <w:ilvl w:val="1"/>
+          <w:numId w:val="2"/>
+        </w:numPr>
+        <w:rPr>
+          <w:sz w:val="22"/>
+          <w:szCs w:val="22"/>
+          <w:lang w:val="es-ES"/>
+        </w:rPr>
+      </w:pPr>
+      <w:r>
+        <w:rPr>
+          <w:sz w:val="22"/>
+          <w:szCs w:val="22"/>
+          <w:lang w:val="es-ES"/>
+        </w:rPr>
+        <w:t>Como administrador del restaurante, quiero</w:t>
+      </w:r>
+      <w:r>
+        <w:rPr>
+          <w:sz w:val="22"/>
+          <w:szCs w:val="22"/>
+          <w:lang w:val="es-ES"/>
+        </w:rPr>
+        <w:t xml:space="preserve"> añadir productos al inventario, para que puedan ser comercializados.</w:t>
       </w:r>
     </w:p>
     <w:p>
       <w:pPr>
         <w:pStyle w:val="Prrafodelista"/>
-        <w:rPr>
-          <w:lang w:val="es-ES"/>
-        </w:rPr>
-      </w:pPr>
+        <w:numPr>
+          <w:ilvl w:val="1"/>
+          <w:numId w:val="2"/>
+        </w:numPr>
+        <w:rPr>
+          <w:sz w:val="22"/>
+          <w:szCs w:val="22"/>
+          <w:lang w:val="es-ES"/>
+        </w:rPr>
+      </w:pPr>
+      <w:r>
+        <w:rPr>
+          <w:sz w:val="22"/>
+          <w:szCs w:val="22"/>
+          <w:lang w:val="es-ES"/>
+        </w:rPr>
+        <w:t xml:space="preserve"> Como administrador del restaurante, </w:t>
+      </w:r>
+      <w:r>
+        <w:rPr>
+          <w:sz w:val="22"/>
+          <w:szCs w:val="22"/>
+          <w:lang w:val="es-ES"/>
+        </w:rPr>
+        <w:t>quiero editar los productos q</w:t>
+      </w:r>
+      <w:r>
+        <w:rPr>
+          <w:sz w:val="22"/>
+          <w:szCs w:val="22"/>
+          <w:lang w:val="es-ES"/>
+        </w:rPr>
+        <w:t>ue</w:t>
+      </w:r>
+      <w:r>
+        <w:rPr>
+          <w:sz w:val="22"/>
+          <w:szCs w:val="22"/>
+          <w:lang w:val="es-ES"/>
+        </w:rPr>
+        <w:t xml:space="preserve"> sean ingresados</w:t>
+      </w:r>
+      <w:r>
+        <w:rPr>
+          <w:sz w:val="22"/>
+          <w:szCs w:val="22"/>
+          <w:lang w:val="es-ES"/>
+        </w:rPr>
+        <w:t xml:space="preserve"> al inventario</w:t>
+      </w:r>
+      <w:r>
+        <w:rPr>
+          <w:sz w:val="22"/>
+          <w:szCs w:val="22"/>
+          <w:lang w:val="es-ES"/>
+        </w:rPr>
+        <w:t>, para darle su uso en el negocio.</w:t>
+      </w:r>
     </w:p>
     <w:p>
       <w:pPr>
+        <w:pStyle w:val="Prrafodelista"/>
+        <w:numPr>
+          <w:ilvl w:val="1"/>
+          <w:numId w:val="2"/>
+        </w:numPr>
+        <w:rPr>
+          <w:sz w:val="22"/>
+          <w:szCs w:val="22"/>
+          <w:lang w:val="es-ES"/>
+        </w:rPr>
+      </w:pPr>
+      <w:r>
+        <w:rPr>
+          <w:sz w:val="22"/>
+          <w:szCs w:val="22"/>
+          <w:lang w:val="es-ES"/>
+        </w:rPr>
+        <w:t xml:space="preserve">Como administrador del restaurante, quiero </w:t>
+      </w:r>
+      <w:r>
+        <w:rPr>
+          <w:sz w:val="22"/>
+          <w:szCs w:val="22"/>
+          <w:lang w:val="es-ES"/>
+        </w:rPr>
+        <w:t>eliminar productos del inventario.</w:t>
+      </w:r>
+    </w:p>
+    <w:p>
+      <w:pPr>
+        <w:pStyle w:val="Prrafodelista"/>
+        <w:ind w:left="735"/>
+        <w:rPr>
+          <w:sz w:val="22"/>
+          <w:szCs w:val="22"/>
+          <w:lang w:val="es-ES"/>
+        </w:rPr>
+      </w:pPr>
+    </w:p>
+    <w:p>
+      <w:pPr>
+        <w:pStyle w:val="Prrafodelista"/>
+        <w:numPr>
+          <w:ilvl w:val="0"/>
+          <w:numId w:val="2"/>
+        </w:numPr>
         <w:rPr>
           <w:b/>
           <w:bCs/>
-          <w:lang w:val="es-ES"/>
-        </w:rPr>
-      </w:pPr>
+          <w:sz w:val="28"/>
+          <w:szCs w:val="28"/>
+          <w:lang w:val="es-ES"/>
+        </w:rPr>
+      </w:pPr>
+      <w:r>
+        <w:rPr>
+          <w:b/>
+          <w:bCs/>
+          <w:sz w:val="28"/>
+          <w:szCs w:val="28"/>
+          <w:lang w:val="es-ES"/>
+        </w:rPr>
+        <w:t xml:space="preserve">Historia: </w:t>
+      </w:r>
+      <w:r>
+        <w:rPr>
+          <w:b/>
+          <w:bCs/>
+          <w:sz w:val="28"/>
+          <w:szCs w:val="28"/>
+          <w:lang w:val="es-ES"/>
+        </w:rPr>
+        <w:t>Administrador-</w:t>
+      </w:r>
+      <w:r>
+        <w:rPr>
+          <w:b/>
+          <w:bCs/>
+          <w:sz w:val="28"/>
+          <w:szCs w:val="28"/>
+          <w:lang w:val="es-ES"/>
+        </w:rPr>
+        <w:t>Catalogo</w:t>
+      </w:r>
+      <w:r>
+        <w:rPr>
+          <w:b/>
+          <w:bCs/>
+          <w:sz w:val="28"/>
+          <w:szCs w:val="28"/>
+          <w:lang w:val="es-ES"/>
+        </w:rPr>
+        <w:t xml:space="preserve"> </w:t>
+      </w:r>
+    </w:p>
+    <w:p>
+      <w:pPr>
+        <w:pStyle w:val="Prrafodelista"/>
+        <w:numPr>
+          <w:ilvl w:val="1"/>
+          <w:numId w:val="2"/>
+        </w:numPr>
+        <w:rPr>
+          <w:sz w:val="22"/>
+          <w:szCs w:val="22"/>
+          <w:lang w:val="es-ES"/>
+        </w:rPr>
+      </w:pPr>
+      <w:r>
+        <w:rPr>
+          <w:sz w:val="22"/>
+          <w:szCs w:val="22"/>
+          <w:lang w:val="es-ES"/>
+        </w:rPr>
+        <w:t>Como administrador del restaurante, quiero añadir productos al</w:t>
+      </w:r>
+      <w:r>
+        <w:rPr>
+          <w:sz w:val="22"/>
+          <w:szCs w:val="22"/>
+          <w:lang w:val="es-ES"/>
+        </w:rPr>
+        <w:t xml:space="preserve"> catálogo</w:t>
+      </w:r>
+      <w:r>
+        <w:rPr>
+          <w:sz w:val="22"/>
+          <w:szCs w:val="22"/>
+          <w:lang w:val="es-ES"/>
+        </w:rPr>
+        <w:t>, para que puedan ser</w:t>
+      </w:r>
+      <w:r>
+        <w:rPr>
+          <w:sz w:val="22"/>
+          <w:szCs w:val="22"/>
+          <w:lang w:val="es-ES"/>
+        </w:rPr>
+        <w:t xml:space="preserve"> observados de cara al público</w:t>
+      </w:r>
+      <w:r>
+        <w:rPr>
+          <w:sz w:val="22"/>
+          <w:szCs w:val="22"/>
+          <w:lang w:val="es-ES"/>
+        </w:rPr>
+        <w:t>.</w:t>
+      </w:r>
+    </w:p>
+    <w:p>
+      <w:pPr>
+        <w:pStyle w:val="Prrafodelista"/>
+        <w:numPr>
+          <w:ilvl w:val="1"/>
+          <w:numId w:val="2"/>
+        </w:numPr>
+        <w:rPr>
+          <w:sz w:val="22"/>
+          <w:szCs w:val="22"/>
+          <w:lang w:val="es-ES"/>
+        </w:rPr>
+      </w:pPr>
+      <w:r>
+        <w:rPr>
+          <w:sz w:val="22"/>
+          <w:szCs w:val="22"/>
+          <w:lang w:val="es-ES"/>
+        </w:rPr>
+        <w:t xml:space="preserve"> Como administrador del restaurante, quiero editar los productos q</w:t>
+      </w:r>
+      <w:r>
+        <w:rPr>
+          <w:sz w:val="22"/>
+          <w:szCs w:val="22"/>
+          <w:lang w:val="es-ES"/>
+        </w:rPr>
+        <w:t xml:space="preserve">ue </w:t>
+      </w:r>
+      <w:r>
+        <w:rPr>
+          <w:sz w:val="22"/>
+          <w:szCs w:val="22"/>
+          <w:lang w:val="es-ES"/>
+        </w:rPr>
+        <w:t>sean ingresados</w:t>
+      </w:r>
+      <w:r>
+        <w:rPr>
+          <w:sz w:val="22"/>
+          <w:szCs w:val="22"/>
+          <w:lang w:val="es-ES"/>
+        </w:rPr>
+        <w:t xml:space="preserve"> al </w:t>
+      </w:r>
+      <w:r>
+        <w:rPr>
+          <w:sz w:val="22"/>
+          <w:szCs w:val="22"/>
+          <w:lang w:val="es-ES"/>
+        </w:rPr>
+        <w:t>catálogo.</w:t>
+      </w:r>
+    </w:p>
+    <w:p>
+      <w:pPr>
+        <w:pStyle w:val="Prrafodelista"/>
+        <w:numPr>
+          <w:ilvl w:val="1"/>
+          <w:numId w:val="2"/>
+        </w:numPr>
+        <w:rPr>
+          <w:sz w:val="22"/>
+          <w:szCs w:val="22"/>
+          <w:lang w:val="es-ES"/>
+        </w:rPr>
+      </w:pPr>
+      <w:r>
+        <w:rPr>
+          <w:sz w:val="22"/>
+          <w:szCs w:val="22"/>
+          <w:lang w:val="es-ES"/>
+        </w:rPr>
+        <w:t>Como administrador del restaurante, quiero eliminar productos del</w:t>
+      </w:r>
+      <w:r>
+        <w:rPr>
+          <w:sz w:val="22"/>
+          <w:szCs w:val="22"/>
+          <w:lang w:val="es-ES"/>
+        </w:rPr>
+        <w:t xml:space="preserve"> </w:t>
+      </w:r>
+      <w:r>
+        <w:rPr>
+          <w:sz w:val="22"/>
+          <w:szCs w:val="22"/>
+          <w:lang w:val="es-ES"/>
+        </w:rPr>
+        <w:t>catálogo</w:t>
+      </w:r>
+      <w:r>
+        <w:rPr>
+          <w:sz w:val="22"/>
+          <w:szCs w:val="22"/>
+          <w:lang w:val="es-ES"/>
+        </w:rPr>
+        <w:t>.</w:t>
+      </w:r>
+    </w:p>
+    <w:p>
+      <w:pPr>
+        <w:ind w:left="360"/>
+        <w:rPr>
+          <w:sz w:val="22"/>
+          <w:szCs w:val="22"/>
+          <w:lang w:val="es-ES"/>
+        </w:rPr>
+      </w:pPr>
+    </w:p>
+    <w:p>
+      <w:pPr>
+        <w:pStyle w:val="Prrafodelista"/>
+        <w:numPr>
+          <w:ilvl w:val="0"/>
+          <w:numId w:val="2"/>
+        </w:numPr>
+        <w:rPr>
+          <w:b/>
+          <w:bCs/>
+          <w:sz w:val="28"/>
+          <w:szCs w:val="28"/>
+          <w:lang w:val="es-ES"/>
+        </w:rPr>
+      </w:pPr>
+      <w:r>
+        <w:rPr>
+          <w:b/>
+          <w:bCs/>
+          <w:sz w:val="28"/>
+          <w:szCs w:val="28"/>
+          <w:lang w:val="es-ES"/>
+        </w:rPr>
+        <w:t xml:space="preserve">Historia: </w:t>
+      </w:r>
+      <w:r>
+        <w:rPr>
+          <w:b/>
+          <w:bCs/>
+          <w:sz w:val="28"/>
+          <w:szCs w:val="28"/>
+          <w:lang w:val="es-ES"/>
+        </w:rPr>
+        <w:t>Administrador-</w:t>
+      </w:r>
+      <w:r>
+        <w:rPr>
+          <w:b/>
+          <w:bCs/>
+          <w:sz w:val="28"/>
+          <w:szCs w:val="28"/>
+          <w:lang w:val="es-ES"/>
+        </w:rPr>
+        <w:t xml:space="preserve"> </w:t>
+      </w:r>
+      <w:r>
+        <w:rPr>
+          <w:b/>
+          <w:bCs/>
+          <w:sz w:val="28"/>
+          <w:szCs w:val="28"/>
+          <w:lang w:val="es-ES"/>
+        </w:rPr>
+        <w:t>Log</w:t>
+      </w:r>
+      <w:r>
+        <w:rPr>
+          <w:b/>
+          <w:bCs/>
+          <w:sz w:val="28"/>
+          <w:szCs w:val="28"/>
+          <w:lang w:val="es-ES"/>
+        </w:rPr>
+        <w:t>g</w:t>
+      </w:r>
+      <w:r>
+        <w:rPr>
+          <w:b/>
+          <w:bCs/>
+          <w:sz w:val="28"/>
+          <w:szCs w:val="28"/>
+          <w:lang w:val="es-ES"/>
+        </w:rPr>
+        <w:t>ers</w:t>
+      </w:r>
+      <w:r>
+        <w:rPr>
+          <w:b/>
+          <w:bCs/>
+          <w:sz w:val="28"/>
+          <w:szCs w:val="28"/>
+          <w:lang w:val="es-ES"/>
+        </w:rPr>
+        <w:tab/>
+      </w:r>
+      <w:r>
+        <w:rPr>
+          <w:b/>
+          <w:bCs/>
+          <w:sz w:val="28"/>
+          <w:szCs w:val="28"/>
+          <w:lang w:val="es-ES"/>
+        </w:rPr>
+        <w:t xml:space="preserve"> </w:t>
+      </w:r>
+    </w:p>
+    <w:p>
+      <w:pPr>
+        <w:pStyle w:val="Prrafodelista"/>
+        <w:numPr>
+          <w:ilvl w:val="1"/>
+          <w:numId w:val="2"/>
+        </w:numPr>
+        <w:rPr>
+          <w:sz w:val="22"/>
+          <w:szCs w:val="22"/>
+          <w:lang w:val="es-ES"/>
+        </w:rPr>
+      </w:pPr>
+      <w:r>
+        <w:rPr>
+          <w:sz w:val="22"/>
+          <w:szCs w:val="22"/>
+          <w:lang w:val="es-ES"/>
+        </w:rPr>
+        <w:t xml:space="preserve">Como administrador del </w:t>
+      </w:r>
+      <w:r>
+        <w:rPr>
+          <w:sz w:val="22"/>
+          <w:szCs w:val="22"/>
+          <w:lang w:val="es-ES"/>
+        </w:rPr>
+        <w:t>restaurante</w:t>
+      </w:r>
+      <w:r>
+        <w:rPr>
+          <w:sz w:val="22"/>
+          <w:szCs w:val="22"/>
+          <w:lang w:val="es-ES"/>
+        </w:rPr>
+        <w:t>,</w:t>
+      </w:r>
+      <w:r>
+        <w:rPr>
+          <w:sz w:val="22"/>
+          <w:szCs w:val="22"/>
+          <w:lang w:val="es-ES"/>
+        </w:rPr>
+        <w:t xml:space="preserve"> q</w:t>
+      </w:r>
+      <w:r>
+        <w:rPr>
+          <w:sz w:val="22"/>
+          <w:szCs w:val="22"/>
+          <w:lang w:val="es-ES"/>
+        </w:rPr>
+        <w:t>uiero que se generen registros de todas las acciones del sistema,</w:t>
+      </w:r>
+      <w:r>
+        <w:rPr>
+          <w:sz w:val="22"/>
+          <w:szCs w:val="22"/>
+          <w:lang w:val="es-ES"/>
+        </w:rPr>
+        <w:t xml:space="preserve"> p</w:t>
+      </w:r>
+      <w:r>
+        <w:rPr>
+          <w:sz w:val="22"/>
+          <w:szCs w:val="22"/>
+          <w:lang w:val="es-ES"/>
+        </w:rPr>
+        <w:t>ara poder revisar actividades y detectar problemas o errores.</w:t>
+      </w:r>
+    </w:p>
+    <w:p>
+      <w:pPr>
+        <w:pStyle w:val="Prrafodelista"/>
+        <w:numPr>
+          <w:ilvl w:val="1"/>
+          <w:numId w:val="2"/>
+        </w:numPr>
+        <w:rPr>
+          <w:sz w:val="22"/>
+          <w:szCs w:val="22"/>
+          <w:lang w:val="es-ES"/>
+        </w:rPr>
+      </w:pPr>
+      <w:r>
+        <w:rPr>
+          <w:sz w:val="22"/>
+          <w:szCs w:val="22"/>
+          <w:lang w:val="es-ES"/>
+        </w:rPr>
+        <w:t>Como administrador,</w:t>
+      </w:r>
+      <w:r>
+        <w:rPr>
+          <w:sz w:val="22"/>
+          <w:szCs w:val="22"/>
+          <w:lang w:val="es-ES"/>
+        </w:rPr>
+        <w:t xml:space="preserve"> q</w:t>
+      </w:r>
+      <w:r>
+        <w:rPr>
+          <w:sz w:val="22"/>
+          <w:szCs w:val="22"/>
+          <w:lang w:val="es-ES"/>
+        </w:rPr>
+        <w:t>uiero poder consultar los registros de acciones del sistema</w:t>
+      </w:r>
+      <w:r>
+        <w:rPr>
+          <w:sz w:val="22"/>
+          <w:szCs w:val="22"/>
+          <w:lang w:val="es-ES"/>
+        </w:rPr>
+        <w:t>, p</w:t>
+      </w:r>
+      <w:r>
+        <w:rPr>
+          <w:sz w:val="22"/>
+          <w:szCs w:val="22"/>
+          <w:lang w:val="es-ES"/>
+        </w:rPr>
+        <w:t>ara auditar quién hizo qué y cuándo</w:t>
+      </w:r>
+      <w:r>
+        <w:rPr>
+          <w:sz w:val="22"/>
+          <w:szCs w:val="22"/>
+          <w:lang w:val="es-ES"/>
+        </w:rPr>
+        <w:t>.</w:t>
+      </w:r>
+    </w:p>
+    <w:p>
+      <w:pPr>
+        <w:pStyle w:val="Prrafodelista"/>
+        <w:numPr>
+          <w:ilvl w:val="1"/>
+          <w:numId w:val="2"/>
+        </w:numPr>
+        <w:rPr>
+          <w:sz w:val="22"/>
+          <w:szCs w:val="22"/>
+          <w:lang w:val="es-ES"/>
+        </w:rPr>
+      </w:pPr>
+      <w:r>
+        <w:rPr>
+          <w:sz w:val="22"/>
+          <w:szCs w:val="22"/>
+          <w:lang w:val="es-ES"/>
+        </w:rPr>
+        <w:t>Como administrador del restaurante,</w:t>
+      </w:r>
+      <w:r>
+        <w:rPr>
+          <w:sz w:val="22"/>
+          <w:szCs w:val="22"/>
+          <w:lang w:val="es-ES"/>
+        </w:rPr>
+        <w:t xml:space="preserve"> q</w:t>
+      </w:r>
+      <w:r>
+        <w:rPr>
+          <w:sz w:val="22"/>
+          <w:szCs w:val="22"/>
+          <w:lang w:val="es-ES"/>
+        </w:rPr>
+        <w:t>uiero un menú interactivo para gestionar los productos del catálogo y del inventario,</w:t>
+      </w:r>
+      <w:r>
+        <w:rPr>
+          <w:sz w:val="22"/>
+          <w:szCs w:val="22"/>
+          <w:lang w:val="es-ES"/>
+        </w:rPr>
+        <w:t xml:space="preserve"> p</w:t>
+      </w:r>
+      <w:r>
+        <w:rPr>
+          <w:sz w:val="22"/>
+          <w:szCs w:val="22"/>
+          <w:lang w:val="es-ES"/>
+        </w:rPr>
+        <w:t>ara poder agregar, editar o eliminar productos fácilmente.</w:t>
+      </w:r>
     </w:p>
     <w:sectPr>
       <w:pgSz w:w="12240" w:h="15840"/>
@@ -181,23 +1081,19 @@
 </file>
 
 <file path=word/numbering.xml><?xml version="1.0" encoding="utf-8"?>
-<w:numbering xmlns:wpc="http://schemas.microsoft.com/office/word/2010/wordprocessingCanvas" xmlns:cx="http://schemas.microsoft.com/office/drawing/2014/chartex" xmlns:cx1="http://schemas.microsoft.com/office/drawing/2015/9/8/chartex" xmlns:cx2="http://schemas.microsoft.com/office/drawing/2015/10/21/chartex" xmlns:cx3="http://schemas.microsoft.com/office/drawing/2016/5/9/chartex" xmlns:cx4="http://schemas.microsoft.com/office/drawing/2016/5/10/chartex" xmlns:cx5="http://schemas.microsoft.com/office/drawing/2016/5/11/chartex" xmlns:cx6="http://schemas.microsoft.com/office/drawing/2016/5/12/chartex" xmlns:cx7="http://schemas.microsoft.com/office/drawing/2016/5/13/chartex" xmlns:cx8="http://schemas.microsoft.com/office/drawing/2016/5/14/chartex" xmlns:mc="http://schemas.openxmlformats.org/markup-compatibility/2006" xmlns:aink="http://schemas.microsoft.com/office/drawing/2016/ink" xmlns:am3d="http://schemas.microsoft.com/office/drawing/2017/model3d" xmlns:o="urn:schemas-microsoft-com:office:office" xmlns:oel="http://schemas.microsoft.com/office/2019/extlst" xmlns:r="http://schemas.openxmlformats.org/officeDocument/2006/relationships" xmlns:m="http://schemas.openxmlformats.org/officeDocument/2006/math" xmlns:v="urn:schemas-microsoft-com:vml" xmlns:wp14="http://schemas.microsoft.com/office/word/2010/wordprocessingDrawing" xmlns:wp="http://schemas.openxmlformats.org/drawingml/2006/wordprocessingDrawing" xmlns:w10="urn:schemas-microsoft-com:office:word" xmlns:w="http://schemas.openxmlformats.org/wordprocessingml/2006/main" xmlns:w14="http://schemas.microsoft.com/office/word/2010/wordml" xmlns:w15="http://schemas.microsoft.com/office/word/2012/wordml" xmlns:w16cex="http://schemas.microsoft.com/office/word/2018/wordml/cex" xmlns:w16cid="http://schemas.microsoft.com/office/word/2016/wordml/cid" xmlns:w16="http://schemas.microsoft.com/office/word/2018/wordml" xmlns:w16du="http://schemas.microsoft.com/office/word/2023/wordml/word16du" xmlns:w16sdtdh="http://schemas.microsoft.com/office/word/2020/wordml/sdtdatahash" xmlns:w16sdtfl="http://schemas.microsoft.com/office/word/2024/wordml/sdtformatlock" xmlns:w16se="http://schemas.microsoft.com/office/word/2015/wordml/symex" xmlns:wpg="http://schemas.microsoft.com/office/word/2010/wordprocessingGroup" xmlns:wpi="http://schemas.microsoft.com/office/word/2010/wordprocessingInk" xmlns:wne="http://schemas.microsoft.com/office/word/2006/wordml" xmlns:wps="http://schemas.microsoft.com/office/word/2010/wordprocessingShape" mc:Ignorable="w14 w15 w16se w16cid w16 w16cex w16sdtdh w16sdtfl w16du wp14">
+<w:numbering xmlns:wpc="http://schemas.microsoft.com/office/word/2010/wordprocessingCanvas" xmlns:cx="http://schemas.microsoft.com/office/drawing/2014/chartex" xmlns:cx1="http://schemas.microsoft.com/office/drawing/2015/9/8/chartex" xmlns:cx2="http://schemas.microsoft.com/office/drawing/2015/10/21/chartex" xmlns:cx3="http://schemas.microsoft.com/office/drawing/2016/5/9/chartex" xmlns:cx4="http://schemas.microsoft.com/office/drawing/2016/5/10/chartex" xmlns:cx5="http://schemas.microsoft.com/office/drawing/2016/5/11/chartex" xmlns:cx6="http://schemas.microsoft.com/office/drawing/2016/5/12/chartex" xmlns:cx7="http://schemas.microsoft.com/office/drawing/2016/5/13/chartex" xmlns:cx8="http://schemas.microsoft.com/office/drawing/2016/5/14/chartex" xmlns:mc="http://schemas.openxmlformats.org/markup-compatibility/2006" xmlns:aink="http://schemas.microsoft.com/office/drawing/2016/ink" xmlns:am3d="http://schemas.microsoft.com/office/drawing/2017/model3d" xmlns:o="urn:schemas-microsoft-com:office:office" xmlns:oel="http://schemas.microsoft.com/office/2019/extlst" xmlns:r="http://schemas.openxmlformats.org/officeDocument/2006/relationships" xmlns:m="http://schemas.openxmlformats.org/officeDocument/2006/math" xmlns:v="urn:schemas-microsoft-com:vml" xmlns:wp14="http://schemas.microsoft.com/office/word/2010/wordprocessingDrawing" xmlns:wp="http://schemas.openxmlformats.org/drawingml/2006/wordprocessingDrawing" xmlns:w10="urn:schemas-microsoft-com:office:word" xmlns:w="http://schemas.openxmlformats.org/wordprocessingml/2006/main" xmlns:w14="http://schemas.microsoft.com/office/word/2010/wordml" xmlns:w15="http://schemas.microsoft.com/office/word/2012/wordml" xmlns:w16cex="http://schemas.microsoft.com/office/word/2018/wordml/cex" xmlns:w16cid="http://schemas.microsoft.com/office/word/2016/wordml/cid" xmlns:w16="http://schemas.microsoft.com/office/word/2018/wordml" xmlns:w16du="http://schemas.microsoft.com/office/word/2023/wordml/word16du" xmlns:w16sdtdh="http://schemas.microsoft.com/office/word/2020/wordml/sdtdatahash" xmlns:w16se="http://schemas.microsoft.com/office/word/2015/wordml/symex" xmlns:wpg="http://schemas.microsoft.com/office/word/2010/wordprocessingGroup" xmlns:wpi="http://schemas.microsoft.com/office/word/2010/wordprocessingInk" xmlns:wne="http://schemas.microsoft.com/office/word/2006/wordml" xmlns:wps="http://schemas.microsoft.com/office/word/2010/wordprocessingShape" mc:Ignorable="w14 w15 w16se w16cid w16 w16cex w16sdtdh wp14">
   <w:abstractNum w:abstractNumId="0" w15:restartNumberingAfterBreak="0">
-    <w:nsid w:val="198111CF"/>
+    <w:nsid w:val="16E76010"/>
     <w:multiLevelType w:val="hybridMultilevel"/>
-    <w:tmpl w:val="B8C4CE04"/>
+    <w:tmpl w:val="37BC82CA"/>
     <w:lvl w:ilvl="0" w:tplc="240A000F">
       <w:start w:val="1"/>
       <w:numFmt w:val="decimal"/>
       <w:lvlText w:val="%1."/>
       <w:lvlJc w:val="left"/>
       <w:pPr>
-        <w:ind w:left="720" w:hanging="360"/>
-      </w:pPr>
-      <w:rPr>
-        <w:rFonts w:hint="default"/>
-        <w:b w:val="0"/>
-      </w:rPr>
+        <w:ind w:left="1080" w:hanging="360"/>
+      </w:pPr>
     </w:lvl>
     <w:lvl w:ilvl="1" w:tplc="240A0019" w:tentative="1">
       <w:start w:val="1"/>
@@ -205,7 +1101,7 @@
       <w:lvlText w:val="%2."/>
       <w:lvlJc w:val="left"/>
       <w:pPr>
-        <w:ind w:left="1440" w:hanging="360"/>
+        <w:ind w:left="1800" w:hanging="360"/>
       </w:pPr>
     </w:lvl>
     <w:lvl w:ilvl="2" w:tplc="240A001B" w:tentative="1">
@@ -214,7 +1110,7 @@
       <w:lvlText w:val="%3."/>
       <w:lvlJc w:val="right"/>
       <w:pPr>
-        <w:ind w:left="2160" w:hanging="180"/>
+        <w:ind w:left="2520" w:hanging="180"/>
       </w:pPr>
     </w:lvl>
     <w:lvl w:ilvl="3" w:tplc="240A000F" w:tentative="1">
@@ -223,7 +1119,7 @@
       <w:lvlText w:val="%4."/>
       <w:lvlJc w:val="left"/>
       <w:pPr>
-        <w:ind w:left="2880" w:hanging="360"/>
+        <w:ind w:left="3240" w:hanging="360"/>
       </w:pPr>
     </w:lvl>
     <w:lvl w:ilvl="4" w:tplc="240A0019" w:tentative="1">
@@ -232,7 +1128,7 @@
       <w:lvlText w:val="%5."/>
       <w:lvlJc w:val="left"/>
       <w:pPr>
-        <w:ind w:left="3600" w:hanging="360"/>
+        <w:ind w:left="3960" w:hanging="360"/>
       </w:pPr>
     </w:lvl>
     <w:lvl w:ilvl="5" w:tplc="240A001B" w:tentative="1">
@@ -241,7 +1137,7 @@
       <w:lvlText w:val="%6."/>
       <w:lvlJc w:val="right"/>
       <w:pPr>
-        <w:ind w:left="4320" w:hanging="180"/>
+        <w:ind w:left="4680" w:hanging="180"/>
       </w:pPr>
     </w:lvl>
     <w:lvl w:ilvl="6" w:tplc="240A000F" w:tentative="1">
@@ -250,7 +1146,7 @@
       <w:lvlText w:val="%7."/>
       <w:lvlJc w:val="left"/>
       <w:pPr>
-        <w:ind w:left="5040" w:hanging="360"/>
+        <w:ind w:left="5400" w:hanging="360"/>
       </w:pPr>
     </w:lvl>
     <w:lvl w:ilvl="7" w:tplc="240A0019" w:tentative="1">
@@ -259,7 +1155,7 @@
       <w:lvlText w:val="%8."/>
       <w:lvlJc w:val="left"/>
       <w:pPr>
-        <w:ind w:left="5760" w:hanging="360"/>
+        <w:ind w:left="6120" w:hanging="360"/>
       </w:pPr>
     </w:lvl>
     <w:lvl w:ilvl="8" w:tplc="240A001B" w:tentative="1">
@@ -268,11 +1164,133 @@
       <w:lvlText w:val="%9."/>
       <w:lvlJc w:val="right"/>
       <w:pPr>
-        <w:ind w:left="6480" w:hanging="180"/>
+        <w:ind w:left="6840" w:hanging="180"/>
       </w:pPr>
     </w:lvl>
   </w:abstractNum>
   <w:abstractNum w:abstractNumId="1" w15:restartNumberingAfterBreak="0">
+    <w:nsid w:val="198111CF"/>
+    <w:multiLevelType w:val="multilevel"/>
+    <w:tmpl w:val="A78EA274"/>
+    <w:lvl w:ilvl="0">
+      <w:start w:val="1"/>
+      <w:numFmt w:val="decimal"/>
+      <w:lvlText w:val="%1."/>
+      <w:lvlJc w:val="left"/>
+      <w:pPr>
+        <w:ind w:left="720" w:hanging="360"/>
+      </w:pPr>
+      <w:rPr>
+        <w:rFonts w:hint="default"/>
+        <w:b w:val="0"/>
+      </w:rPr>
+    </w:lvl>
+    <w:lvl w:ilvl="1">
+      <w:start w:val="1"/>
+      <w:numFmt w:val="decimal"/>
+      <w:isLgl/>
+      <w:lvlText w:val="%1.%2"/>
+      <w:lvlJc w:val="left"/>
+      <w:pPr>
+        <w:ind w:left="735" w:hanging="375"/>
+      </w:pPr>
+      <w:rPr>
+        <w:rFonts w:hint="default"/>
+      </w:rPr>
+    </w:lvl>
+    <w:lvl w:ilvl="2">
+      <w:start w:val="1"/>
+      <w:numFmt w:val="decimal"/>
+      <w:isLgl/>
+      <w:lvlText w:val="%1.%2.%3"/>
+      <w:lvlJc w:val="left"/>
+      <w:pPr>
+        <w:ind w:left="1080" w:hanging="720"/>
+      </w:pPr>
+      <w:rPr>
+        <w:rFonts w:hint="default"/>
+      </w:rPr>
+    </w:lvl>
+    <w:lvl w:ilvl="3">
+      <w:start w:val="1"/>
+      <w:numFmt w:val="decimal"/>
+      <w:isLgl/>
+      <w:lvlText w:val="%1.%2.%3.%4"/>
+      <w:lvlJc w:val="left"/>
+      <w:pPr>
+        <w:ind w:left="1440" w:hanging="1080"/>
+      </w:pPr>
+      <w:rPr>
+        <w:rFonts w:hint="default"/>
+      </w:rPr>
+    </w:lvl>
+    <w:lvl w:ilvl="4">
+      <w:start w:val="1"/>
+      <w:numFmt w:val="decimal"/>
+      <w:isLgl/>
+      <w:lvlText w:val="%1.%2.%3.%4.%5"/>
+      <w:lvlJc w:val="left"/>
+      <w:pPr>
+        <w:ind w:left="1440" w:hanging="1080"/>
+      </w:pPr>
+      <w:rPr>
+        <w:rFonts w:hint="default"/>
+      </w:rPr>
+    </w:lvl>
+    <w:lvl w:ilvl="5">
+      <w:start w:val="1"/>
+      <w:numFmt w:val="decimal"/>
+      <w:isLgl/>
+      <w:lvlText w:val="%1.%2.%3.%4.%5.%6"/>
+      <w:lvlJc w:val="left"/>
+      <w:pPr>
+        <w:ind w:left="1800" w:hanging="1440"/>
+      </w:pPr>
+      <w:rPr>
+        <w:rFonts w:hint="default"/>
+      </w:rPr>
+    </w:lvl>
+    <w:lvl w:ilvl="6">
+      <w:start w:val="1"/>
+      <w:numFmt w:val="decimal"/>
+      <w:isLgl/>
+      <w:lvlText w:val="%1.%2.%3.%4.%5.%6.%7"/>
+      <w:lvlJc w:val="left"/>
+      <w:pPr>
+        <w:ind w:left="1800" w:hanging="1440"/>
+      </w:pPr>
+      <w:rPr>
+        <w:rFonts w:hint="default"/>
+      </w:rPr>
+    </w:lvl>
+    <w:lvl w:ilvl="7">
+      <w:start w:val="1"/>
+      <w:numFmt w:val="decimal"/>
+      <w:isLgl/>
+      <w:lvlText w:val="%1.%2.%3.%4.%5.%6.%7.%8"/>
+      <w:lvlJc w:val="left"/>
+      <w:pPr>
+        <w:ind w:left="2160" w:hanging="1800"/>
+      </w:pPr>
+      <w:rPr>
+        <w:rFonts w:hint="default"/>
+      </w:rPr>
+    </w:lvl>
+    <w:lvl w:ilvl="8">
+      <w:start w:val="1"/>
+      <w:numFmt w:val="decimal"/>
+      <w:isLgl/>
+      <w:lvlText w:val="%1.%2.%3.%4.%5.%6.%7.%8.%9"/>
+      <w:lvlJc w:val="left"/>
+      <w:pPr>
+        <w:ind w:left="2160" w:hanging="1800"/>
+      </w:pPr>
+      <w:rPr>
+        <w:rFonts w:hint="default"/>
+      </w:rPr>
+    </w:lvl>
+  </w:abstractNum>
+  <w:abstractNum w:abstractNumId="2" w15:restartNumberingAfterBreak="0">
     <w:nsid w:val="549770A4"/>
     <w:multiLevelType w:val="hybridMultilevel"/>
     <w:tmpl w:val="91A853F2"/>
@@ -385,16 +1403,19 @@
     </w:lvl>
   </w:abstractNum>
   <w:num w:numId="1" w16cid:durableId="540939813">
+    <w:abstractNumId w:val="2"/>
+  </w:num>
+  <w:num w:numId="2" w16cid:durableId="1147235937">
     <w:abstractNumId w:val="1"/>
   </w:num>
-  <w:num w:numId="2" w16cid:durableId="1147235937">
+  <w:num w:numId="3" w16cid:durableId="362899603">
     <w:abstractNumId w:val="0"/>
   </w:num>
 </w:numbering>
 </file>
 
 <file path=word/styles.xml><?xml version="1.0" encoding="utf-8"?>
-<w:styles xmlns:mc="http://schemas.openxmlformats.org/markup-compatibility/2006" xmlns:r="http://schemas.openxmlformats.org/officeDocument/2006/relationships" xmlns:w="http://schemas.openxmlformats.org/wordprocessingml/2006/main" xmlns:w14="http://schemas.microsoft.com/office/word/2010/wordml" xmlns:w15="http://schemas.microsoft.com/office/word/2012/wordml" xmlns:w16cex="http://schemas.microsoft.com/office/word/2018/wordml/cex" xmlns:w16cid="http://schemas.microsoft.com/office/word/2016/wordml/cid" xmlns:w16="http://schemas.microsoft.com/office/word/2018/wordml" xmlns:w16du="http://schemas.microsoft.com/office/word/2023/wordml/word16du" xmlns:w16sdtdh="http://schemas.microsoft.com/office/word/2020/wordml/sdtdatahash" xmlns:w16sdtfl="http://schemas.microsoft.com/office/word/2024/wordml/sdtformatlock" xmlns:w16se="http://schemas.microsoft.com/office/word/2015/wordml/symex" mc:Ignorable="w14 w15 w16se w16cid w16 w16cex w16sdtdh w16sdtfl w16du">
+<w:styles xmlns:mc="http://schemas.openxmlformats.org/markup-compatibility/2006" xmlns:r="http://schemas.openxmlformats.org/officeDocument/2006/relationships" xmlns:w="http://schemas.openxmlformats.org/wordprocessingml/2006/main" xmlns:w14="http://schemas.microsoft.com/office/word/2010/wordml" xmlns:w15="http://schemas.microsoft.com/office/word/2012/wordml" xmlns:w16cex="http://schemas.microsoft.com/office/word/2018/wordml/cex" xmlns:w16cid="http://schemas.microsoft.com/office/word/2016/wordml/cid" xmlns:w16="http://schemas.microsoft.com/office/word/2018/wordml" xmlns:w16sdtdh="http://schemas.microsoft.com/office/word/2020/wordml/sdtdatahash" xmlns:w16se="http://schemas.microsoft.com/office/word/2015/wordml/symex" mc:Ignorable="w14 w15 w16se w16cid w16 w16cex w16sdtdh">
   <w:docDefaults>
     <w:rPrDefault>
       <w:rPr>
@@ -1626,4 +2647,16 @@
     </a:ext>
   </a:extLst>
 </a:theme>
+</file>
+
+<file path=customXml/item1.xml><?xml version="1.0" encoding="utf-8"?>
+<b:Sources xmlns:b="http://schemas.openxmlformats.org/officeDocument/2006/bibliography" xmlns="http://schemas.openxmlformats.org/officeDocument/2006/bibliography" SelectedStyle="\APASixthEditionOfficeOnline.xsl" StyleName="APA" Version="6"/>
+</file>
+
+<file path=customXml/itemProps1.xml><?xml version="1.0" encoding="utf-8"?>
+<ds:datastoreItem xmlns:ds="http://schemas.openxmlformats.org/officeDocument/2006/customXml" ds:itemID="{2A3ECD0F-5195-4CF4-A106-738AD93771BB}">
+  <ds:schemaRefs>
+    <ds:schemaRef ds:uri="http://schemas.openxmlformats.org/officeDocument/2006/bibliography"/>
+  </ds:schemaRefs>
+</ds:datastoreItem>
 </file>
</xml_diff>